<commit_message>
Trails of Blood & Dust: callings rebalanced, each with its own ability
Every calling's four core skills follow one recipe: a fighting skill, a
trail skill, a people skill and a signature skill, with every skill core
for at least one calling and none for more than four (Shooting six). Each
calling gains an ability of the same size: +2 in one situation, a small
sure thing once per job, or one positional edge. The creator shows it in
step 1 and on the sheet, the guide's callings table lists it, and the
build checks the recipe.

Co-Authored-By: Claude Opus 5.5 <noreply@anthropic.com>
Claude-Session: https://claude.ai/code/session_015SADCFzhKijkC2foUmXrpC
</commit_message>
<xml_diff>
--- a/legend-dynamics/western/Trails_of_Blood_Dust_Players_Guide.docx
+++ b/legend-dynamics/western/Trails_of_Blood_Dust_Players_Guide.docx
@@ -294,10 +294,11 @@
         </w:tblBorders>
       </w:tblPr>
       <w:tblGrid>
-        <w:gridCol w:w="1980"/>
-        <w:gridCol w:w="1980"/>
-        <w:gridCol w:w="1980"/>
-        <w:gridCol w:w="1980"/>
+        <w:gridCol w:w="1584"/>
+        <w:gridCol w:w="1584"/>
+        <w:gridCol w:w="1584"/>
+        <w:gridCol w:w="1584"/>
+        <w:gridCol w:w="1584"/>
       </w:tblGrid>
       <w:tr>
         <w:trPr>
@@ -375,6 +376,24 @@
             </w:r>
           </w:p>
         </w:tc>
+        <w:tc>
+          <w:tcPr>
+            <w:shd w:val="clear" w:fill="E6E8E6"/>
+          </w:tcPr>
+          <w:p>
+            <w:pPr>
+              <w:pStyle w:val="Compact"/>
+              <w:jc w:val="left"/>
+            </w:pPr>
+            <w:r>
+              <w:rPr>
+                <w:b/>
+                <w:sz w:val="19"/>
+              </w:rPr>
+              <w:t xml:space="preserve">Ability</w:t>
+            </w:r>
+          </w:p>
+        </w:tc>
       </w:tr>
       <w:tr>
         <w:tc>
@@ -434,7 +453,36 @@
               <w:rPr>
                 <w:sz w:val="19"/>
               </w:rPr>
-              <w:t xml:space="preserve">Shooting, Investigation, Read People, Riding</w:t>
+              <w:t xml:space="preserve">Shooting, Riding, Leadership, Law</w:t>
+            </w:r>
+          </w:p>
+        </w:tc>
+        <w:tc>
+          <w:tcPr/>
+          <w:p>
+            <w:pPr>
+              <w:pStyle w:val="Compact"/>
+              <w:jc w:val="left"/>
+            </w:pPr>
+            <w:r>
+              <w:rPr>
+                <w:bCs/>
+                <w:b/>
+                <w:sz w:val="19"/>
+              </w:rPr>
+              <w:t xml:space="preserve">The badge.</w:t>
+            </w:r>
+            <w:r>
+              <w:rPr>
+                <w:sz w:val="19"/>
+              </w:rPr>
+              <w:t xml:space="preserve"> </w:t>
+            </w:r>
+            <w:r>
+              <w:rPr>
+                <w:sz w:val="19"/>
+              </w:rPr>
+              <w:t xml:space="preserve">+2 to Leadership when you give orders in the law’s name: an arrest, raising a posse, clearing a street.</w:t>
             </w:r>
           </w:p>
         </w:tc>
@@ -497,7 +545,36 @@
               <w:rPr>
                 <w:sz w:val="19"/>
               </w:rPr>
-              <w:t xml:space="preserve">Tracking, Shooting, Riding, Survival</w:t>
+              <w:t xml:space="preserve">Shooting, Tracking, Read People, Investigation</w:t>
+            </w:r>
+          </w:p>
+        </w:tc>
+        <w:tc>
+          <w:tcPr/>
+          <w:p>
+            <w:pPr>
+              <w:pStyle w:val="Compact"/>
+              <w:jc w:val="left"/>
+            </w:pPr>
+            <w:r>
+              <w:rPr>
+                <w:bCs/>
+                <w:b/>
+                <w:sz w:val="19"/>
+              </w:rPr>
+              <w:t xml:space="preserve">Paper on them.</w:t>
+            </w:r>
+            <w:r>
+              <w:rPr>
+                <w:sz w:val="19"/>
+              </w:rPr>
+              <w:t xml:space="preserve"> </w:t>
+            </w:r>
+            <w:r>
+              <w:rPr>
+                <w:sz w:val="19"/>
+              </w:rPr>
+              <w:t xml:space="preserve">+2 to Tracking and Investigation to find someone with a price on their head or a warrant out.</w:t>
             </w:r>
           </w:p>
         </w:tc>
@@ -560,7 +637,36 @@
               <w:rPr>
                 <w:sz w:val="19"/>
               </w:rPr>
-              <w:t xml:space="preserve">Medicine, Investigation, Read People, Persuasion</w:t>
+              <w:t xml:space="preserve">Shooting, Riding, Persuasion, Medicine</w:t>
+            </w:r>
+          </w:p>
+        </w:tc>
+        <w:tc>
+          <w:tcPr/>
+          <w:p>
+            <w:pPr>
+              <w:pStyle w:val="Compact"/>
+              <w:jc w:val="left"/>
+            </w:pPr>
+            <w:r>
+              <w:rPr>
+                <w:bCs/>
+                <w:b/>
+                <w:sz w:val="19"/>
+              </w:rPr>
+              <w:t xml:space="preserve">Steady hands.</w:t>
+            </w:r>
+            <w:r>
+              <w:rPr>
+                <w:sz w:val="19"/>
+              </w:rPr>
+              <w:t xml:space="preserve"> </w:t>
+            </w:r>
+            <w:r>
+              <w:rPr>
+                <w:sz w:val="19"/>
+              </w:rPr>
+              <w:t xml:space="preserve">+2 to Medicine when stabilizing the Dying or working under fire.</w:t>
             </w:r>
           </w:p>
         </w:tc>
@@ -623,7 +729,36 @@
               <w:rPr>
                 <w:sz w:val="19"/>
               </w:rPr>
-              <w:t xml:space="preserve">Occult, Investigation, Persuasion, Read People</w:t>
+              <w:t xml:space="preserve">Melee, Stealth, Deception, Occult</w:t>
+            </w:r>
+          </w:p>
+        </w:tc>
+        <w:tc>
+          <w:tcPr/>
+          <w:p>
+            <w:pPr>
+              <w:pStyle w:val="Compact"/>
+              <w:jc w:val="left"/>
+            </w:pPr>
+            <w:r>
+              <w:rPr>
+                <w:bCs/>
+                <w:b/>
+                <w:sz w:val="19"/>
+              </w:rPr>
+              <w:t xml:space="preserve">Forbidden lore.</w:t>
+            </w:r>
+            <w:r>
+              <w:rPr>
+                <w:sz w:val="19"/>
+              </w:rPr>
+              <w:t xml:space="preserve"> </w:t>
+            </w:r>
+            <w:r>
+              <w:rPr>
+                <w:sz w:val="19"/>
+              </w:rPr>
+              <w:t xml:space="preserve">Once per job, ask the GM one question about a supernatural thing you’ve seen, and get a true answer.</w:t>
             </w:r>
           </w:p>
         </w:tc>
@@ -686,7 +821,36 @@
               <w:rPr>
                 <w:sz w:val="19"/>
               </w:rPr>
-              <w:t xml:space="preserve">Law, Persuasion, Read People, Investigation</w:t>
+              <w:t xml:space="preserve">Brawling, Athletics, Deception, Law</w:t>
+            </w:r>
+          </w:p>
+        </w:tc>
+        <w:tc>
+          <w:tcPr/>
+          <w:p>
+            <w:pPr>
+              <w:pStyle w:val="Compact"/>
+              <w:jc w:val="left"/>
+            </w:pPr>
+            <w:r>
+              <w:rPr>
+                <w:bCs/>
+                <w:b/>
+                <w:sz w:val="19"/>
+              </w:rPr>
+              <w:t xml:space="preserve">Due process.</w:t>
+            </w:r>
+            <w:r>
+              <w:rPr>
+                <w:sz w:val="19"/>
+              </w:rPr>
+              <w:t xml:space="preserve"> </w:t>
+            </w:r>
+            <w:r>
+              <w:rPr>
+                <w:sz w:val="19"/>
+              </w:rPr>
+              <w:t xml:space="preserve">Once per job, get someone out of jail, a warrant issued or quashed, or a deed or contract into your hands, wherever there’s law to work.</w:t>
             </w:r>
           </w:p>
         </w:tc>
@@ -749,7 +913,36 @@
               <w:rPr>
                 <w:sz w:val="19"/>
               </w:rPr>
-              <w:t xml:space="preserve">Investigation, Persuasion, Read People, Stealth</w:t>
+              <w:t xml:space="preserve">Brawling, Stealth, Read People, Investigation</w:t>
+            </w:r>
+          </w:p>
+        </w:tc>
+        <w:tc>
+          <w:tcPr/>
+          <w:p>
+            <w:pPr>
+              <w:pStyle w:val="Compact"/>
+              <w:jc w:val="left"/>
+            </w:pPr>
+            <w:r>
+              <w:rPr>
+                <w:bCs/>
+                <w:b/>
+                <w:sz w:val="19"/>
+              </w:rPr>
+              <w:t xml:space="preserve">The press.</w:t>
+            </w:r>
+            <w:r>
+              <w:rPr>
+                <w:sz w:val="19"/>
+              </w:rPr>
+              <w:t xml:space="preserve"> </w:t>
+            </w:r>
+            <w:r>
+              <w:rPr>
+                <w:sz w:val="19"/>
+              </w:rPr>
+              <w:t xml:space="preserve">Once per job, print a story; the town believes it until someone proves it false.</w:t>
             </w:r>
           </w:p>
         </w:tc>
@@ -812,7 +1005,36 @@
               <w:rPr>
                 <w:sz w:val="19"/>
               </w:rPr>
-              <w:t xml:space="preserve">Persuasion, Leadership, Occult, Shooting</w:t>
+              <w:t xml:space="preserve">Shooting, Riding, Leadership, Occult</w:t>
+            </w:r>
+          </w:p>
+        </w:tc>
+        <w:tc>
+          <w:tcPr/>
+          <w:p>
+            <w:pPr>
+              <w:pStyle w:val="Compact"/>
+              <w:jc w:val="left"/>
+            </w:pPr>
+            <w:r>
+              <w:rPr>
+                <w:bCs/>
+                <w:b/>
+                <w:sz w:val="19"/>
+              </w:rPr>
+              <w:t xml:space="preserve">Hold fast.</w:t>
+            </w:r>
+            <w:r>
+              <w:rPr>
+                <w:sz w:val="19"/>
+              </w:rPr>
+              <w:t xml:space="preserve"> </w:t>
+            </w:r>
+            <w:r>
+              <w:rPr>
+                <w:sz w:val="19"/>
+              </w:rPr>
+              <w:t xml:space="preserve">+2 to Will against fear, possession and temptation, and to Leadership to steady others against them.</w:t>
             </w:r>
           </w:p>
         </w:tc>
@@ -875,7 +1097,36 @@
               <w:rPr>
                 <w:sz w:val="19"/>
               </w:rPr>
-              <w:t xml:space="preserve">Occult, Tracking, Shooting, Melee</w:t>
+              <w:t xml:space="preserve">Melee, Tracking, Read People, Occult</w:t>
+            </w:r>
+          </w:p>
+        </w:tc>
+        <w:tc>
+          <w:tcPr/>
+          <w:p>
+            <w:pPr>
+              <w:pStyle w:val="Compact"/>
+              <w:jc w:val="left"/>
+            </w:pPr>
+            <w:r>
+              <w:rPr>
+                <w:bCs/>
+                <w:b/>
+                <w:sz w:val="19"/>
+              </w:rPr>
+              <w:t xml:space="preserve">Know its weakness.</w:t>
+            </w:r>
+            <w:r>
+              <w:rPr>
+                <w:sz w:val="19"/>
+              </w:rPr>
+              <w:t xml:space="preserve"> </w:t>
+            </w:r>
+            <w:r>
+              <w:rPr>
+                <w:sz w:val="19"/>
+              </w:rPr>
+              <w:t xml:space="preserve">Once you’ve identified a creature with an Occult roll, your called shots against it take no penalty.</w:t>
             </w:r>
           </w:p>
         </w:tc>
@@ -938,7 +1189,36 @@
               <w:rPr>
                 <w:sz w:val="19"/>
               </w:rPr>
-              <w:t xml:space="preserve">Shooting, Athletics, Read People, Riding</w:t>
+              <w:t xml:space="preserve">Shooting, Riding, Read People, Athletics</w:t>
+            </w:r>
+          </w:p>
+        </w:tc>
+        <w:tc>
+          <w:tcPr/>
+          <w:p>
+            <w:pPr>
+              <w:pStyle w:val="Compact"/>
+              <w:jc w:val="left"/>
+            </w:pPr>
+            <w:r>
+              <w:rPr>
+                <w:bCs/>
+                <w:b/>
+                <w:sz w:val="19"/>
+              </w:rPr>
+              <w:t xml:space="preserve">Quick draw.</w:t>
+            </w:r>
+            <w:r>
+              <w:rPr>
+                <w:sz w:val="19"/>
+              </w:rPr>
+              <w:t xml:space="preserve"> </w:t>
+            </w:r>
+            <w:r>
+              <w:rPr>
+                <w:sz w:val="19"/>
+              </w:rPr>
+              <w:t xml:space="preserve">In the first round of a gunfight, you act first, whatever your Agility.</w:t>
             </w:r>
           </w:p>
         </w:tc>
@@ -1001,7 +1281,36 @@
               <w:rPr>
                 <w:sz w:val="19"/>
               </w:rPr>
-              <w:t xml:space="preserve">Tracking, Survival, Riding, Stealth</w:t>
+              <w:t xml:space="preserve">Melee, Tracking, Persuasion, Survival</w:t>
+            </w:r>
+          </w:p>
+        </w:tc>
+        <w:tc>
+          <w:tcPr/>
+          <w:p>
+            <w:pPr>
+              <w:pStyle w:val="Compact"/>
+              <w:jc w:val="left"/>
+            </w:pPr>
+            <w:r>
+              <w:rPr>
+                <w:bCs/>
+                <w:b/>
+                <w:sz w:val="19"/>
+              </w:rPr>
+              <w:t xml:space="preserve">Lay of the land.</w:t>
+            </w:r>
+            <w:r>
+              <w:rPr>
+                <w:sz w:val="19"/>
+              </w:rPr>
+              <w:t xml:space="preserve"> </w:t>
+            </w:r>
+            <w:r>
+              <w:rPr>
+                <w:sz w:val="19"/>
+              </w:rPr>
+              <w:t xml:space="preserve">Once per job, you know a way: a hidden pass, a water hole, a shortcut that saves a day, or a place to make a stand.</w:t>
             </w:r>
           </w:p>
         </w:tc>
@@ -1064,7 +1373,36 @@
               <w:rPr>
                 <w:sz w:val="19"/>
               </w:rPr>
-              <w:t xml:space="preserve">Gambling, Read People, Deception, Shooting</w:t>
+              <w:t xml:space="preserve">Shooting, Stealth, Deception, Gambling</w:t>
+            </w:r>
+          </w:p>
+        </w:tc>
+        <w:tc>
+          <w:tcPr/>
+          <w:p>
+            <w:pPr>
+              <w:pStyle w:val="Compact"/>
+              <w:jc w:val="left"/>
+            </w:pPr>
+            <w:r>
+              <w:rPr>
+                <w:bCs/>
+                <w:b/>
+                <w:sz w:val="19"/>
+              </w:rPr>
+              <w:t xml:space="preserve">Markers.</w:t>
+            </w:r>
+            <w:r>
+              <w:rPr>
+                <w:sz w:val="19"/>
+              </w:rPr>
+              <w:t xml:space="preserve"> </w:t>
+            </w:r>
+            <w:r>
+              <w:rPr>
+                <w:sz w:val="19"/>
+              </w:rPr>
+              <w:t xml:space="preserve">Once per job, call in a debt: someone owes you a favor, a horse, a room or the truth.</w:t>
             </w:r>
           </w:p>
         </w:tc>
@@ -1127,7 +1465,36 @@
               <w:rPr>
                 <w:sz w:val="19"/>
               </w:rPr>
-              <w:t xml:space="preserve">Animal Handling, Riding, Survival, Brawling</w:t>
+              <w:t xml:space="preserve">Brawling, Animal Handling, Leadership, Tinkering</w:t>
+            </w:r>
+          </w:p>
+        </w:tc>
+        <w:tc>
+          <w:tcPr/>
+          <w:p>
+            <w:pPr>
+              <w:pStyle w:val="Compact"/>
+              <w:jc w:val="left"/>
+            </w:pPr>
+            <w:r>
+              <w:rPr>
+                <w:bCs/>
+                <w:b/>
+                <w:sz w:val="19"/>
+              </w:rPr>
+              <w:t xml:space="preserve">Horse sense.</w:t>
+            </w:r>
+            <w:r>
+              <w:rPr>
+                <w:sz w:val="19"/>
+              </w:rPr>
+              <w:t xml:space="preserve"> </w:t>
+            </w:r>
+            <w:r>
+              <w:rPr>
+                <w:sz w:val="19"/>
+              </w:rPr>
+              <w:t xml:space="preserve">+2 to Animal Handling, and to Riding to stay in the saddle in a stampede, a chase or a fall.</w:t>
             </w:r>
           </w:p>
         </w:tc>
@@ -1190,7 +1557,36 @@
               <w:rPr>
                 <w:sz w:val="19"/>
               </w:rPr>
-              <w:t xml:space="preserve">Occult, Medicine, Investigation, Melee</w:t>
+              <w:t xml:space="preserve">Melee, Stealth, Persuasion, Medicine</w:t>
+            </w:r>
+          </w:p>
+        </w:tc>
+        <w:tc>
+          <w:tcPr/>
+          <w:p>
+            <w:pPr>
+              <w:pStyle w:val="Compact"/>
+              <w:jc w:val="left"/>
+            </w:pPr>
+            <w:r>
+              <w:rPr>
+                <w:bCs/>
+                <w:b/>
+                <w:sz w:val="19"/>
+              </w:rPr>
+              <w:t xml:space="preserve">Ask the body.</w:t>
+            </w:r>
+            <w:r>
+              <w:rPr>
+                <w:sz w:val="19"/>
+              </w:rPr>
+              <w:t xml:space="preserve"> </w:t>
+            </w:r>
+            <w:r>
+              <w:rPr>
+                <w:sz w:val="19"/>
+              </w:rPr>
+              <w:t xml:space="preserve">Once per job, examine a corpse and learn how and when it died, and one thing about who did it.</w:t>
             </w:r>
           </w:p>
         </w:tc>

</xml_diff>

<commit_message>
Trails of Blood & Dust: The Law grows to four callings
The Lawyer moves to The Law, and two callings join: the Circuit Judge (The
Law; Brawling, Survival, Leadership, Law; Heard it all before: +2 to Read
People to catch a lie told to your face) and the Shotgun Messenger (The
Frontier; Shooting, Animal Handling, Persuasion, Survival; Riding shotgun:
once per fight, take a hit meant for someone next to you). The groups are
now four, four and seven; Shooting's cap in the calling recipe goes to seven.

Co-Authored-By: Claude Opus 5.5 <noreply@anthropic.com>
Claude-Session: https://claude.ai/code/session_015SADCFzhKijkC2foUmXrpC
</commit_message>
<xml_diff>
--- a/legend-dynamics/western/Trails_of_Blood_Dust_Players_Guide.docx
+++ b/legend-dynamics/western/Trails_of_Blood_Dust_Players_Guide.docx
@@ -592,6 +592,190 @@
                 <w:b/>
                 <w:sz w:val="19"/>
               </w:rPr>
+              <w:t xml:space="preserve">Lawyer</w:t>
+            </w:r>
+          </w:p>
+        </w:tc>
+        <w:tc>
+          <w:tcPr/>
+          <w:p>
+            <w:pPr>
+              <w:pStyle w:val="Compact"/>
+              <w:jc w:val="left"/>
+            </w:pPr>
+            <w:r>
+              <w:rPr>
+                <w:sz w:val="19"/>
+              </w:rPr>
+              <w:t xml:space="preserve">The Law</w:t>
+            </w:r>
+          </w:p>
+        </w:tc>
+        <w:tc>
+          <w:tcPr/>
+          <w:p>
+            <w:pPr>
+              <w:pStyle w:val="Compact"/>
+              <w:jc w:val="left"/>
+            </w:pPr>
+            <w:r>
+              <w:rPr>
+                <w:sz w:val="19"/>
+              </w:rPr>
+              <w:t xml:space="preserve">knows the law better than the men who wear the badges, and isn’t afraid to say so.</w:t>
+            </w:r>
+          </w:p>
+        </w:tc>
+        <w:tc>
+          <w:tcPr/>
+          <w:p>
+            <w:pPr>
+              <w:pStyle w:val="Compact"/>
+              <w:jc w:val="left"/>
+            </w:pPr>
+            <w:r>
+              <w:rPr>
+                <w:sz w:val="19"/>
+              </w:rPr>
+              <w:t xml:space="preserve">Brawling, Athletics, Deception, Law</w:t>
+            </w:r>
+          </w:p>
+        </w:tc>
+        <w:tc>
+          <w:tcPr/>
+          <w:p>
+            <w:pPr>
+              <w:pStyle w:val="Compact"/>
+              <w:jc w:val="left"/>
+            </w:pPr>
+            <w:r>
+              <w:rPr>
+                <w:bCs/>
+                <w:b/>
+                <w:sz w:val="19"/>
+              </w:rPr>
+              <w:t xml:space="preserve">Due process.</w:t>
+            </w:r>
+            <w:r>
+              <w:rPr>
+                <w:sz w:val="19"/>
+              </w:rPr>
+              <w:t xml:space="preserve"> </w:t>
+            </w:r>
+            <w:r>
+              <w:rPr>
+                <w:sz w:val="19"/>
+              </w:rPr>
+              <w:t xml:space="preserve">Once per job, get someone out of jail, a warrant issued or quashed, or a deed or contract into your hands, wherever there’s law to work.</w:t>
+            </w:r>
+          </w:p>
+        </w:tc>
+      </w:tr>
+      <w:tr>
+        <w:tc>
+          <w:tcPr/>
+          <w:p>
+            <w:pPr>
+              <w:pStyle w:val="Compact"/>
+              <w:jc w:val="left"/>
+            </w:pPr>
+            <w:r>
+              <w:rPr>
+                <w:b/>
+                <w:sz w:val="19"/>
+              </w:rPr>
+              <w:t xml:space="preserve">Circuit Judge</w:t>
+            </w:r>
+          </w:p>
+        </w:tc>
+        <w:tc>
+          <w:tcPr/>
+          <w:p>
+            <w:pPr>
+              <w:pStyle w:val="Compact"/>
+              <w:jc w:val="left"/>
+            </w:pPr>
+            <w:r>
+              <w:rPr>
+                <w:sz w:val="19"/>
+              </w:rPr>
+              <w:t xml:space="preserve">The Law</w:t>
+            </w:r>
+          </w:p>
+        </w:tc>
+        <w:tc>
+          <w:tcPr/>
+          <w:p>
+            <w:pPr>
+              <w:pStyle w:val="Compact"/>
+              <w:jc w:val="left"/>
+            </w:pPr>
+            <w:r>
+              <w:rPr>
+                <w:sz w:val="19"/>
+              </w:rPr>
+              <w:t xml:space="preserve">rides from town to town holding court, and not every town wants one.</w:t>
+            </w:r>
+          </w:p>
+        </w:tc>
+        <w:tc>
+          <w:tcPr/>
+          <w:p>
+            <w:pPr>
+              <w:pStyle w:val="Compact"/>
+              <w:jc w:val="left"/>
+            </w:pPr>
+            <w:r>
+              <w:rPr>
+                <w:sz w:val="19"/>
+              </w:rPr>
+              <w:t xml:space="preserve">Brawling, Survival, Leadership, Law</w:t>
+            </w:r>
+          </w:p>
+        </w:tc>
+        <w:tc>
+          <w:tcPr/>
+          <w:p>
+            <w:pPr>
+              <w:pStyle w:val="Compact"/>
+              <w:jc w:val="left"/>
+            </w:pPr>
+            <w:r>
+              <w:rPr>
+                <w:bCs/>
+                <w:b/>
+                <w:sz w:val="19"/>
+              </w:rPr>
+              <w:t xml:space="preserve">Heard it all before.</w:t>
+            </w:r>
+            <w:r>
+              <w:rPr>
+                <w:sz w:val="19"/>
+              </w:rPr>
+              <w:t xml:space="preserve"> </w:t>
+            </w:r>
+            <w:r>
+              <w:rPr>
+                <w:sz w:val="19"/>
+              </w:rPr>
+              <w:t xml:space="preserve">+2 to Read People to catch a lie told to your face.</w:t>
+            </w:r>
+          </w:p>
+        </w:tc>
+      </w:tr>
+      <w:tr>
+        <w:tc>
+          <w:tcPr/>
+          <w:p>
+            <w:pPr>
+              <w:pStyle w:val="Compact"/>
+              <w:jc w:val="left"/>
+            </w:pPr>
+            <w:r>
+              <w:rPr>
+                <w:b/>
+                <w:sz w:val="19"/>
+              </w:rPr>
               <w:t xml:space="preserve">Doctor</w:t>
             </w:r>
           </w:p>
@@ -776,7 +960,7 @@
                 <w:b/>
                 <w:sz w:val="19"/>
               </w:rPr>
-              <w:t xml:space="preserve">Lawyer</w:t>
+              <w:t xml:space="preserve">Journalist</w:t>
             </w:r>
           </w:p>
         </w:tc>
@@ -806,22 +990,22 @@
               <w:rPr>
                 <w:sz w:val="19"/>
               </w:rPr>
-              <w:t xml:space="preserve">knows the law better than the men who wear the badges, and isn’t afraid to say so.</w:t>
-            </w:r>
-          </w:p>
-        </w:tc>
-        <w:tc>
-          <w:tcPr/>
-          <w:p>
-            <w:pPr>
-              <w:pStyle w:val="Compact"/>
-              <w:jc w:val="left"/>
-            </w:pPr>
-            <w:r>
-              <w:rPr>
-                <w:sz w:val="19"/>
-              </w:rPr>
-              <w:t xml:space="preserve">Brawling, Athletics, Deception, Law</w:t>
+              <w:t xml:space="preserve">asks the questions no one wants asked, and prints the answers.</w:t>
+            </w:r>
+          </w:p>
+        </w:tc>
+        <w:tc>
+          <w:tcPr/>
+          <w:p>
+            <w:pPr>
+              <w:pStyle w:val="Compact"/>
+              <w:jc w:val="left"/>
+            </w:pPr>
+            <w:r>
+              <w:rPr>
+                <w:sz w:val="19"/>
+              </w:rPr>
+              <w:t xml:space="preserve">Brawling, Stealth, Read People, Investigation</w:t>
             </w:r>
           </w:p>
         </w:tc>
@@ -838,7 +1022,7 @@
                 <w:b/>
                 <w:sz w:val="19"/>
               </w:rPr>
-              <w:t xml:space="preserve">Due process.</w:t>
+              <w:t xml:space="preserve">The press.</w:t>
             </w:r>
             <w:r>
               <w:rPr>
@@ -850,25 +1034,25 @@
               <w:rPr>
                 <w:sz w:val="19"/>
               </w:rPr>
-              <w:t xml:space="preserve">Once per job, get someone out of jail, a warrant issued or quashed, or a deed or contract into your hands, wherever there’s law to work.</w:t>
-            </w:r>
-          </w:p>
-        </w:tc>
-      </w:tr>
-      <w:tr>
-        <w:tc>
-          <w:tcPr/>
-          <w:p>
-            <w:pPr>
-              <w:pStyle w:val="Compact"/>
-              <w:jc w:val="left"/>
-            </w:pPr>
-            <w:r>
-              <w:rPr>
-                <w:b/>
-                <w:sz w:val="19"/>
-              </w:rPr>
-              <w:t xml:space="preserve">Journalist</w:t>
+              <w:t xml:space="preserve">Once per job, print a story; the town believes it until someone proves it false.</w:t>
+            </w:r>
+          </w:p>
+        </w:tc>
+      </w:tr>
+      <w:tr>
+        <w:tc>
+          <w:tcPr/>
+          <w:p>
+            <w:pPr>
+              <w:pStyle w:val="Compact"/>
+              <w:jc w:val="left"/>
+            </w:pPr>
+            <w:r>
+              <w:rPr>
+                <w:b/>
+                <w:sz w:val="19"/>
+              </w:rPr>
+              <w:t xml:space="preserve">Preacher</w:t>
             </w:r>
           </w:p>
         </w:tc>
@@ -898,22 +1082,22 @@
               <w:rPr>
                 <w:sz w:val="19"/>
               </w:rPr>
-              <w:t xml:space="preserve">asks the questions no one wants asked, and prints the answers.</w:t>
-            </w:r>
-          </w:p>
-        </w:tc>
-        <w:tc>
-          <w:tcPr/>
-          <w:p>
-            <w:pPr>
-              <w:pStyle w:val="Compact"/>
-              <w:jc w:val="left"/>
-            </w:pPr>
-            <w:r>
-              <w:rPr>
-                <w:sz w:val="19"/>
-              </w:rPr>
-              <w:t xml:space="preserve">Brawling, Stealth, Read People, Investigation</w:t>
+              <w:t xml:space="preserve">comforts the frightened, counsels the troubled, and stands up to bad men with faith and a shotgun.</w:t>
+            </w:r>
+          </w:p>
+        </w:tc>
+        <w:tc>
+          <w:tcPr/>
+          <w:p>
+            <w:pPr>
+              <w:pStyle w:val="Compact"/>
+              <w:jc w:val="left"/>
+            </w:pPr>
+            <w:r>
+              <w:rPr>
+                <w:sz w:val="19"/>
+              </w:rPr>
+              <w:t xml:space="preserve">Shooting, Riding, Leadership, Occult</w:t>
             </w:r>
           </w:p>
         </w:tc>
@@ -930,7 +1114,7 @@
                 <w:b/>
                 <w:sz w:val="19"/>
               </w:rPr>
-              <w:t xml:space="preserve">The press.</w:t>
+              <w:t xml:space="preserve">Hold fast.</w:t>
             </w:r>
             <w:r>
               <w:rPr>
@@ -942,70 +1126,70 @@
               <w:rPr>
                 <w:sz w:val="19"/>
               </w:rPr>
-              <w:t xml:space="preserve">Once per job, print a story; the town believes it until someone proves it false.</w:t>
-            </w:r>
-          </w:p>
-        </w:tc>
-      </w:tr>
-      <w:tr>
-        <w:tc>
-          <w:tcPr/>
-          <w:p>
-            <w:pPr>
-              <w:pStyle w:val="Compact"/>
-              <w:jc w:val="left"/>
-            </w:pPr>
-            <w:r>
-              <w:rPr>
-                <w:b/>
-                <w:sz w:val="19"/>
-              </w:rPr>
-              <w:t xml:space="preserve">Preacher</w:t>
-            </w:r>
-          </w:p>
-        </w:tc>
-        <w:tc>
-          <w:tcPr/>
-          <w:p>
-            <w:pPr>
-              <w:pStyle w:val="Compact"/>
-              <w:jc w:val="left"/>
-            </w:pPr>
-            <w:r>
-              <w:rPr>
-                <w:sz w:val="19"/>
-              </w:rPr>
-              <w:t xml:space="preserve">The Learned</w:t>
-            </w:r>
-          </w:p>
-        </w:tc>
-        <w:tc>
-          <w:tcPr/>
-          <w:p>
-            <w:pPr>
-              <w:pStyle w:val="Compact"/>
-              <w:jc w:val="left"/>
-            </w:pPr>
-            <w:r>
-              <w:rPr>
-                <w:sz w:val="19"/>
-              </w:rPr>
-              <w:t xml:space="preserve">comforts the frightened, counsels the troubled, and stands up to bad men with faith and a shotgun.</w:t>
-            </w:r>
-          </w:p>
-        </w:tc>
-        <w:tc>
-          <w:tcPr/>
-          <w:p>
-            <w:pPr>
-              <w:pStyle w:val="Compact"/>
-              <w:jc w:val="left"/>
-            </w:pPr>
-            <w:r>
-              <w:rPr>
-                <w:sz w:val="19"/>
-              </w:rPr>
-              <w:t xml:space="preserve">Shooting, Riding, Leadership, Occult</w:t>
+              <w:t xml:space="preserve">+2 to Will against fear, possession and temptation, and to Leadership to steady others against them.</w:t>
+            </w:r>
+          </w:p>
+        </w:tc>
+      </w:tr>
+      <w:tr>
+        <w:tc>
+          <w:tcPr/>
+          <w:p>
+            <w:pPr>
+              <w:pStyle w:val="Compact"/>
+              <w:jc w:val="left"/>
+            </w:pPr>
+            <w:r>
+              <w:rPr>
+                <w:b/>
+                <w:sz w:val="19"/>
+              </w:rPr>
+              <w:t xml:space="preserve">Monster Hunter</w:t>
+            </w:r>
+          </w:p>
+        </w:tc>
+        <w:tc>
+          <w:tcPr/>
+          <w:p>
+            <w:pPr>
+              <w:pStyle w:val="Compact"/>
+              <w:jc w:val="left"/>
+            </w:pPr>
+            <w:r>
+              <w:rPr>
+                <w:sz w:val="19"/>
+              </w:rPr>
+              <w:t xml:space="preserve">The Frontier</w:t>
+            </w:r>
+          </w:p>
+        </w:tc>
+        <w:tc>
+          <w:tcPr/>
+          <w:p>
+            <w:pPr>
+              <w:pStyle w:val="Compact"/>
+              <w:jc w:val="left"/>
+            </w:pPr>
+            <w:r>
+              <w:rPr>
+                <w:sz w:val="19"/>
+              </w:rPr>
+              <w:t xml:space="preserve">hunts what the law can’t hang, and knows which things fear silver, salt or fire (take the Monster Hunter advantage).</w:t>
+            </w:r>
+          </w:p>
+        </w:tc>
+        <w:tc>
+          <w:tcPr/>
+          <w:p>
+            <w:pPr>
+              <w:pStyle w:val="Compact"/>
+              <w:jc w:val="left"/>
+            </w:pPr>
+            <w:r>
+              <w:rPr>
+                <w:sz w:val="19"/>
+              </w:rPr>
+              <w:t xml:space="preserve">Melee, Tracking, Read People, Occult</w:t>
             </w:r>
           </w:p>
         </w:tc>
@@ -1022,7 +1206,7 @@
                 <w:b/>
                 <w:sz w:val="19"/>
               </w:rPr>
-              <w:t xml:space="preserve">Hold fast.</w:t>
+              <w:t xml:space="preserve">Know its weakness.</w:t>
             </w:r>
             <w:r>
               <w:rPr>
@@ -1034,25 +1218,25 @@
               <w:rPr>
                 <w:sz w:val="19"/>
               </w:rPr>
-              <w:t xml:space="preserve">+2 to Will against fear, possession and temptation, and to Leadership to steady others against them.</w:t>
-            </w:r>
-          </w:p>
-        </w:tc>
-      </w:tr>
-      <w:tr>
-        <w:tc>
-          <w:tcPr/>
-          <w:p>
-            <w:pPr>
-              <w:pStyle w:val="Compact"/>
-              <w:jc w:val="left"/>
-            </w:pPr>
-            <w:r>
-              <w:rPr>
-                <w:b/>
-                <w:sz w:val="19"/>
-              </w:rPr>
-              <w:t xml:space="preserve">Monster Hunter</w:t>
+              <w:t xml:space="preserve">Once you’ve identified a creature with an Occult roll, your called shots against it take no penalty.</w:t>
+            </w:r>
+          </w:p>
+        </w:tc>
+      </w:tr>
+      <w:tr>
+        <w:tc>
+          <w:tcPr/>
+          <w:p>
+            <w:pPr>
+              <w:pStyle w:val="Compact"/>
+              <w:jc w:val="left"/>
+            </w:pPr>
+            <w:r>
+              <w:rPr>
+                <w:b/>
+                <w:sz w:val="19"/>
+              </w:rPr>
+              <w:t xml:space="preserve">Gunslinger</w:t>
             </w:r>
           </w:p>
         </w:tc>
@@ -1082,22 +1266,22 @@
               <w:rPr>
                 <w:sz w:val="19"/>
               </w:rPr>
-              <w:t xml:space="preserve">hunts what the law can’t hang, and knows which things fear silver, salt or fire (take the Monster Hunter advantage).</w:t>
-            </w:r>
-          </w:p>
-        </w:tc>
-        <w:tc>
-          <w:tcPr/>
-          <w:p>
-            <w:pPr>
-              <w:pStyle w:val="Compact"/>
-              <w:jc w:val="left"/>
-            </w:pPr>
-            <w:r>
-              <w:rPr>
-                <w:sz w:val="19"/>
-              </w:rPr>
-              <w:t xml:space="preserve">Melee, Tracking, Read People, Occult</w:t>
+              <w:t xml:space="preserve">the fastest and steadiest gun in the room, and the one who decides when it’s time to draw.</w:t>
+            </w:r>
+          </w:p>
+        </w:tc>
+        <w:tc>
+          <w:tcPr/>
+          <w:p>
+            <w:pPr>
+              <w:pStyle w:val="Compact"/>
+              <w:jc w:val="left"/>
+            </w:pPr>
+            <w:r>
+              <w:rPr>
+                <w:sz w:val="19"/>
+              </w:rPr>
+              <w:t xml:space="preserve">Shooting, Riding, Read People, Athletics</w:t>
             </w:r>
           </w:p>
         </w:tc>
@@ -1114,7 +1298,7 @@
                 <w:b/>
                 <w:sz w:val="19"/>
               </w:rPr>
-              <w:t xml:space="preserve">Know its weakness.</w:t>
+              <w:t xml:space="preserve">Quick draw.</w:t>
             </w:r>
             <w:r>
               <w:rPr>
@@ -1126,25 +1310,25 @@
               <w:rPr>
                 <w:sz w:val="19"/>
               </w:rPr>
-              <w:t xml:space="preserve">Once you’ve identified a creature with an Occult roll, your called shots against it take no penalty.</w:t>
-            </w:r>
-          </w:p>
-        </w:tc>
-      </w:tr>
-      <w:tr>
-        <w:tc>
-          <w:tcPr/>
-          <w:p>
-            <w:pPr>
-              <w:pStyle w:val="Compact"/>
-              <w:jc w:val="left"/>
-            </w:pPr>
-            <w:r>
-              <w:rPr>
-                <w:b/>
-                <w:sz w:val="19"/>
-              </w:rPr>
-              <w:t xml:space="preserve">Gunslinger</w:t>
+              <w:t xml:space="preserve">In the first round of a gunfight, you act first, whatever your Agility.</w:t>
+            </w:r>
+          </w:p>
+        </w:tc>
+      </w:tr>
+      <w:tr>
+        <w:tc>
+          <w:tcPr/>
+          <w:p>
+            <w:pPr>
+              <w:pStyle w:val="Compact"/>
+              <w:jc w:val="left"/>
+            </w:pPr>
+            <w:r>
+              <w:rPr>
+                <w:b/>
+                <w:sz w:val="19"/>
+              </w:rPr>
+              <w:t xml:space="preserve">Scout</w:t>
             </w:r>
           </w:p>
         </w:tc>
@@ -1174,22 +1358,22 @@
               <w:rPr>
                 <w:sz w:val="19"/>
               </w:rPr>
-              <w:t xml:space="preserve">the fastest and steadiest gun in the room, and the one who decides when it’s time to draw.</w:t>
-            </w:r>
-          </w:p>
-        </w:tc>
-        <w:tc>
-          <w:tcPr/>
-          <w:p>
-            <w:pPr>
-              <w:pStyle w:val="Compact"/>
-              <w:jc w:val="left"/>
-            </w:pPr>
-            <w:r>
-              <w:rPr>
-                <w:sz w:val="19"/>
-              </w:rPr>
-              <w:t xml:space="preserve">Shooting, Riding, Read People, Athletics</w:t>
+              <w:t xml:space="preserve">finds the trail, reads the land, and keeps everyone alive out in it.</w:t>
+            </w:r>
+          </w:p>
+        </w:tc>
+        <w:tc>
+          <w:tcPr/>
+          <w:p>
+            <w:pPr>
+              <w:pStyle w:val="Compact"/>
+              <w:jc w:val="left"/>
+            </w:pPr>
+            <w:r>
+              <w:rPr>
+                <w:sz w:val="19"/>
+              </w:rPr>
+              <w:t xml:space="preserve">Melee, Tracking, Persuasion, Survival</w:t>
             </w:r>
           </w:p>
         </w:tc>
@@ -1206,7 +1390,7 @@
                 <w:b/>
                 <w:sz w:val="19"/>
               </w:rPr>
-              <w:t xml:space="preserve">Quick draw.</w:t>
+              <w:t xml:space="preserve">Lay of the land.</w:t>
             </w:r>
             <w:r>
               <w:rPr>
@@ -1218,25 +1402,25 @@
               <w:rPr>
                 <w:sz w:val="19"/>
               </w:rPr>
-              <w:t xml:space="preserve">In the first round of a gunfight, you act first, whatever your Agility.</w:t>
-            </w:r>
-          </w:p>
-        </w:tc>
-      </w:tr>
-      <w:tr>
-        <w:tc>
-          <w:tcPr/>
-          <w:p>
-            <w:pPr>
-              <w:pStyle w:val="Compact"/>
-              <w:jc w:val="left"/>
-            </w:pPr>
-            <w:r>
-              <w:rPr>
-                <w:b/>
-                <w:sz w:val="19"/>
-              </w:rPr>
-              <w:t xml:space="preserve">Scout</w:t>
+              <w:t xml:space="preserve">Once per job, you know a way: a hidden pass, a water hole, a shortcut that saves a day, or a place to make a stand.</w:t>
+            </w:r>
+          </w:p>
+        </w:tc>
+      </w:tr>
+      <w:tr>
+        <w:tc>
+          <w:tcPr/>
+          <w:p>
+            <w:pPr>
+              <w:pStyle w:val="Compact"/>
+              <w:jc w:val="left"/>
+            </w:pPr>
+            <w:r>
+              <w:rPr>
+                <w:b/>
+                <w:sz w:val="19"/>
+              </w:rPr>
+              <w:t xml:space="preserve">Gambler</w:t>
             </w:r>
           </w:p>
         </w:tc>
@@ -1266,22 +1450,22 @@
               <w:rPr>
                 <w:sz w:val="19"/>
               </w:rPr>
-              <w:t xml:space="preserve">finds the trail, reads the land, and keeps everyone alive out in it.</w:t>
-            </w:r>
-          </w:p>
-        </w:tc>
-        <w:tc>
-          <w:tcPr/>
-          <w:p>
-            <w:pPr>
-              <w:pStyle w:val="Compact"/>
-              <w:jc w:val="left"/>
-            </w:pPr>
-            <w:r>
-              <w:rPr>
-                <w:sz w:val="19"/>
-              </w:rPr>
-              <w:t xml:space="preserve">Melee, Tracking, Persuasion, Survival</w:t>
+              <w:t xml:space="preserve">reads people, bluffs, and hears everything the saloon hears.</w:t>
+            </w:r>
+          </w:p>
+        </w:tc>
+        <w:tc>
+          <w:tcPr/>
+          <w:p>
+            <w:pPr>
+              <w:pStyle w:val="Compact"/>
+              <w:jc w:val="left"/>
+            </w:pPr>
+            <w:r>
+              <w:rPr>
+                <w:sz w:val="19"/>
+              </w:rPr>
+              <w:t xml:space="preserve">Shooting, Stealth, Deception, Gambling</w:t>
             </w:r>
           </w:p>
         </w:tc>
@@ -1298,7 +1482,7 @@
                 <w:b/>
                 <w:sz w:val="19"/>
               </w:rPr>
-              <w:t xml:space="preserve">Lay of the land.</w:t>
+              <w:t xml:space="preserve">Markers.</w:t>
             </w:r>
             <w:r>
               <w:rPr>
@@ -1310,25 +1494,25 @@
               <w:rPr>
                 <w:sz w:val="19"/>
               </w:rPr>
-              <w:t xml:space="preserve">Once per job, you know a way: a hidden pass, a water hole, a shortcut that saves a day, or a place to make a stand.</w:t>
-            </w:r>
-          </w:p>
-        </w:tc>
-      </w:tr>
-      <w:tr>
-        <w:tc>
-          <w:tcPr/>
-          <w:p>
-            <w:pPr>
-              <w:pStyle w:val="Compact"/>
-              <w:jc w:val="left"/>
-            </w:pPr>
-            <w:r>
-              <w:rPr>
-                <w:b/>
-                <w:sz w:val="19"/>
-              </w:rPr>
-              <w:t xml:space="preserve">Gambler</w:t>
+              <w:t xml:space="preserve">Once per job, call in a debt: someone owes you a favor, a horse, a room or the truth.</w:t>
+            </w:r>
+          </w:p>
+        </w:tc>
+      </w:tr>
+      <w:tr>
+        <w:tc>
+          <w:tcPr/>
+          <w:p>
+            <w:pPr>
+              <w:pStyle w:val="Compact"/>
+              <w:jc w:val="left"/>
+            </w:pPr>
+            <w:r>
+              <w:rPr>
+                <w:b/>
+                <w:sz w:val="19"/>
+              </w:rPr>
+              <w:t xml:space="preserve">Wrangler</w:t>
             </w:r>
           </w:p>
         </w:tc>
@@ -1358,22 +1542,22 @@
               <w:rPr>
                 <w:sz w:val="19"/>
               </w:rPr>
-              <w:t xml:space="preserve">reads people, bluffs, and hears everything the saloon hears.</w:t>
-            </w:r>
-          </w:p>
-        </w:tc>
-        <w:tc>
-          <w:tcPr/>
-          <w:p>
-            <w:pPr>
-              <w:pStyle w:val="Compact"/>
-              <w:jc w:val="left"/>
-            </w:pPr>
-            <w:r>
-              <w:rPr>
-                <w:sz w:val="19"/>
-              </w:rPr>
-              <w:t xml:space="preserve">Shooting, Stealth, Deception, Gambling</w:t>
+              <w:t xml:space="preserve">breaks horses, drives cattle, and can ride anything with four legs.</w:t>
+            </w:r>
+          </w:p>
+        </w:tc>
+        <w:tc>
+          <w:tcPr/>
+          <w:p>
+            <w:pPr>
+              <w:pStyle w:val="Compact"/>
+              <w:jc w:val="left"/>
+            </w:pPr>
+            <w:r>
+              <w:rPr>
+                <w:sz w:val="19"/>
+              </w:rPr>
+              <w:t xml:space="preserve">Brawling, Animal Handling, Leadership, Tinkering</w:t>
             </w:r>
           </w:p>
         </w:tc>
@@ -1390,7 +1574,7 @@
                 <w:b/>
                 <w:sz w:val="19"/>
               </w:rPr>
-              <w:t xml:space="preserve">Markers.</w:t>
+              <w:t xml:space="preserve">Horse sense.</w:t>
             </w:r>
             <w:r>
               <w:rPr>
@@ -1402,25 +1586,25 @@
               <w:rPr>
                 <w:sz w:val="19"/>
               </w:rPr>
-              <w:t xml:space="preserve">Once per job, call in a debt: someone owes you a favor, a horse, a room or the truth.</w:t>
-            </w:r>
-          </w:p>
-        </w:tc>
-      </w:tr>
-      <w:tr>
-        <w:tc>
-          <w:tcPr/>
-          <w:p>
-            <w:pPr>
-              <w:pStyle w:val="Compact"/>
-              <w:jc w:val="left"/>
-            </w:pPr>
-            <w:r>
-              <w:rPr>
-                <w:b/>
-                <w:sz w:val="19"/>
-              </w:rPr>
-              <w:t xml:space="preserve">Wrangler</w:t>
+              <w:t xml:space="preserve">+2 to Animal Handling, and to Riding to stay in the saddle in a stampede, a chase or a fall.</w:t>
+            </w:r>
+          </w:p>
+        </w:tc>
+      </w:tr>
+      <w:tr>
+        <w:tc>
+          <w:tcPr/>
+          <w:p>
+            <w:pPr>
+              <w:pStyle w:val="Compact"/>
+              <w:jc w:val="left"/>
+            </w:pPr>
+            <w:r>
+              <w:rPr>
+                <w:b/>
+                <w:sz w:val="19"/>
+              </w:rPr>
+              <w:t xml:space="preserve">Undertaker</w:t>
             </w:r>
           </w:p>
         </w:tc>
@@ -1450,22 +1634,22 @@
               <w:rPr>
                 <w:sz w:val="19"/>
               </w:rPr>
-              <w:t xml:space="preserve">breaks horses, drives cattle, and can ride anything with four legs.</w:t>
-            </w:r>
-          </w:p>
-        </w:tc>
-        <w:tc>
-          <w:tcPr/>
-          <w:p>
-            <w:pPr>
-              <w:pStyle w:val="Compact"/>
-              <w:jc w:val="left"/>
-            </w:pPr>
-            <w:r>
-              <w:rPr>
-                <w:sz w:val="19"/>
-              </w:rPr>
-              <w:t xml:space="preserve">Brawling, Animal Handling, Leadership, Tinkering</w:t>
+              <w:t xml:space="preserve">buries the dead, and makes sure they stay buried.</w:t>
+            </w:r>
+          </w:p>
+        </w:tc>
+        <w:tc>
+          <w:tcPr/>
+          <w:p>
+            <w:pPr>
+              <w:pStyle w:val="Compact"/>
+              <w:jc w:val="left"/>
+            </w:pPr>
+            <w:r>
+              <w:rPr>
+                <w:sz w:val="19"/>
+              </w:rPr>
+              <w:t xml:space="preserve">Melee, Stealth, Persuasion, Medicine</w:t>
             </w:r>
           </w:p>
         </w:tc>
@@ -1482,7 +1666,7 @@
                 <w:b/>
                 <w:sz w:val="19"/>
               </w:rPr>
-              <w:t xml:space="preserve">Horse sense.</w:t>
+              <w:t xml:space="preserve">Ask the body.</w:t>
             </w:r>
             <w:r>
               <w:rPr>
@@ -1494,25 +1678,25 @@
               <w:rPr>
                 <w:sz w:val="19"/>
               </w:rPr>
-              <w:t xml:space="preserve">+2 to Animal Handling, and to Riding to stay in the saddle in a stampede, a chase or a fall.</w:t>
-            </w:r>
-          </w:p>
-        </w:tc>
-      </w:tr>
-      <w:tr>
-        <w:tc>
-          <w:tcPr/>
-          <w:p>
-            <w:pPr>
-              <w:pStyle w:val="Compact"/>
-              <w:jc w:val="left"/>
-            </w:pPr>
-            <w:r>
-              <w:rPr>
-                <w:b/>
-                <w:sz w:val="19"/>
-              </w:rPr>
-              <w:t xml:space="preserve">Undertaker</w:t>
+              <w:t xml:space="preserve">Once per job, examine a corpse and learn how and when it died, and one thing about who did it.</w:t>
+            </w:r>
+          </w:p>
+        </w:tc>
+      </w:tr>
+      <w:tr>
+        <w:tc>
+          <w:tcPr/>
+          <w:p>
+            <w:pPr>
+              <w:pStyle w:val="Compact"/>
+              <w:jc w:val="left"/>
+            </w:pPr>
+            <w:r>
+              <w:rPr>
+                <w:b/>
+                <w:sz w:val="19"/>
+              </w:rPr>
+              <w:t xml:space="preserve">Shotgun Messenger</w:t>
             </w:r>
           </w:p>
         </w:tc>
@@ -1542,22 +1726,22 @@
               <w:rPr>
                 <w:sz w:val="19"/>
               </w:rPr>
-              <w:t xml:space="preserve">buries the dead, and makes sure they stay buried.</w:t>
-            </w:r>
-          </w:p>
-        </w:tc>
-        <w:tc>
-          <w:tcPr/>
-          <w:p>
-            <w:pPr>
-              <w:pStyle w:val="Compact"/>
-              <w:jc w:val="left"/>
-            </w:pPr>
-            <w:r>
-              <w:rPr>
-                <w:sz w:val="19"/>
-              </w:rPr>
-              <w:t xml:space="preserve">Melee, Stealth, Persuasion, Medicine</w:t>
+              <w:t xml:space="preserve">rides beside the driver guarding the mail, the strongbox and the passengers.</w:t>
+            </w:r>
+          </w:p>
+        </w:tc>
+        <w:tc>
+          <w:tcPr/>
+          <w:p>
+            <w:pPr>
+              <w:pStyle w:val="Compact"/>
+              <w:jc w:val="left"/>
+            </w:pPr>
+            <w:r>
+              <w:rPr>
+                <w:sz w:val="19"/>
+              </w:rPr>
+              <w:t xml:space="preserve">Shooting, Animal Handling, Persuasion, Survival</w:t>
             </w:r>
           </w:p>
         </w:tc>
@@ -1574,7 +1758,7 @@
                 <w:b/>
                 <w:sz w:val="19"/>
               </w:rPr>
-              <w:t xml:space="preserve">Ask the body.</w:t>
+              <w:t xml:space="preserve">Riding shotgun.</w:t>
             </w:r>
             <w:r>
               <w:rPr>
@@ -1586,7 +1770,7 @@
               <w:rPr>
                 <w:sz w:val="19"/>
               </w:rPr>
-              <w:t xml:space="preserve">Once per job, examine a corpse and learn how and when it died, and one thing about who did it.</w:t>
+              <w:t xml:space="preserve">Once per fight, when someone next to you is hit, you take the hit instead.</w:t>
             </w:r>
           </w:p>
         </w:tc>

</xml_diff>

<commit_message>
Trails of Blood & Dust: the Politician joins The Law
Investigation, Riding, Leadership, Law; not a fighter, so its first core
skill is a second signature. Friends in office: once per job, the town or
territory gives what it can. The calling recipe now allows non-fighters,
and Riding and Leadership may be core for five callings.

Co-Authored-By: Claude Opus 5.5 <noreply@anthropic.com>
Claude-Session: https://claude.ai/code/session_015SADCFzhKijkC2foUmXrpC
</commit_message>
<xml_diff>
--- a/legend-dynamics/western/Trails_of_Blood_Dust_Players_Guide.docx
+++ b/legend-dynamics/western/Trails_of_Blood_Dust_Players_Guide.docx
@@ -759,6 +759,98 @@
                 <w:sz w:val="19"/>
               </w:rPr>
               <w:t xml:space="preserve">+2 to Read People to catch a lie told to your face.</w:t>
+            </w:r>
+          </w:p>
+        </w:tc>
+      </w:tr>
+      <w:tr>
+        <w:tc>
+          <w:tcPr/>
+          <w:p>
+            <w:pPr>
+              <w:pStyle w:val="Compact"/>
+              <w:jc w:val="left"/>
+            </w:pPr>
+            <w:r>
+              <w:rPr>
+                <w:b/>
+                <w:sz w:val="19"/>
+              </w:rPr>
+              <w:t xml:space="preserve">Politician</w:t>
+            </w:r>
+          </w:p>
+        </w:tc>
+        <w:tc>
+          <w:tcPr/>
+          <w:p>
+            <w:pPr>
+              <w:pStyle w:val="Compact"/>
+              <w:jc w:val="left"/>
+            </w:pPr>
+            <w:r>
+              <w:rPr>
+                <w:sz w:val="19"/>
+              </w:rPr>
+              <w:t xml:space="preserve">The Law</w:t>
+            </w:r>
+          </w:p>
+        </w:tc>
+        <w:tc>
+          <w:tcPr/>
+          <w:p>
+            <w:pPr>
+              <w:pStyle w:val="Compact"/>
+              <w:jc w:val="left"/>
+            </w:pPr>
+            <w:r>
+              <w:rPr>
+                <w:sz w:val="19"/>
+              </w:rPr>
+              <w:t xml:space="preserve">holds office or wants it: a mayor, an alderman, a territorial delegate, a governor’s man, or a party boss with friends in the capital.</w:t>
+            </w:r>
+          </w:p>
+        </w:tc>
+        <w:tc>
+          <w:tcPr/>
+          <w:p>
+            <w:pPr>
+              <w:pStyle w:val="Compact"/>
+              <w:jc w:val="left"/>
+            </w:pPr>
+            <w:r>
+              <w:rPr>
+                <w:sz w:val="19"/>
+              </w:rPr>
+              <w:t xml:space="preserve">Investigation, Riding, Leadership, Law</w:t>
+            </w:r>
+          </w:p>
+        </w:tc>
+        <w:tc>
+          <w:tcPr/>
+          <w:p>
+            <w:pPr>
+              <w:pStyle w:val="Compact"/>
+              <w:jc w:val="left"/>
+            </w:pPr>
+            <w:r>
+              <w:rPr>
+                <w:bCs/>
+                <w:b/>
+                <w:sz w:val="19"/>
+              </w:rPr>
+              <w:t xml:space="preserve">Friends in office.</w:t>
+            </w:r>
+            <w:r>
+              <w:rPr>
+                <w:sz w:val="19"/>
+              </w:rPr>
+              <w:t xml:space="preserve"> </w:t>
+            </w:r>
+            <w:r>
+              <w:rPr>
+                <w:sz w:val="19"/>
+              </w:rPr>
+              <w:t xml:space="preserve">Once per job, the town or territory gives you what it can: rooms at the hotel, horses for a posse, the jail cells, the telegraph office, or the doctor’s time.</w:t>
             </w:r>
           </w:p>
         </w:tc>

</xml_diff>

<commit_message>
Special loads: buying silver marks Whispers only if folks learn what it's for
Silver is ordinary trade. Word gets around only when people see what it's for:
a smith asked to cast bullets, rounds seen in a gun.

Co-Authored-By: Claude Opus 5.5 <noreply@anthropic.com>
Claude-Session: https://claude.ai/code/session_015SADCFzhKijkC2foUmXrpC
</commit_message>
<xml_diff>
--- a/legend-dynamics/western/Trails_of_Blood_Dust_Players_Guide.docx
+++ b/legend-dynamics/western/Trails_of_Blood_Dust_Players_Guide.docx
@@ -13900,7 +13900,7 @@
               <w:rPr>
                 <w:sz w:val="19"/>
               </w:rPr>
-              <w:t xml:space="preserve">Cast from silver by a gunsmith or anyone with Tinkering. Buying silver in a small town marks Whispers; taking church silver marks Heat.</w:t>
+              <w:t xml:space="preserve">Cast from silver by a gunsmith or anyone with Tinkering. Buying silver is ordinary trade; it marks Whispers only if folks learn what it’s for (a smith asked to cast bullets, rounds seen in your gun). Taking church silver marks Heat.</w:t>
             </w:r>
           </w:p>
         </w:tc>
@@ -14263,13 +14263,13 @@
           <w:bCs/>
           <w:b/>
         </w:rPr>
-        <w:t xml:space="preserve">Getting them costs.</w:t>
-      </w:r>
-      <w:r>
-        <w:t xml:space="preserve"> </w:t>
-      </w:r>
-      <w:r>
-        <w:t xml:space="preserve">Buying silver in a small town gets talked about (Whispers); taking church silver or buying the makings for fire draws the law (Heat). A character with Tinkering can cast silver, hammer cold iron or mix incendiaries; a preacher, or an Occult working, blesses rounds.</w:t>
+        <w:t xml:space="preserve">Getting them can cost.</w:t>
+      </w:r>
+      <w:r>
+        <w:t xml:space="preserve"> </w:t>
+      </w:r>
+      <w:r>
+        <w:t xml:space="preserve">Buying silver is ordinary trade, but if folks learn what it’s for (a smith asked to cast bullets, rounds seen in your gun) word gets around (Whispers); taking church silver or buying the makings for fire draws the law (Heat). A character with Tinkering can cast silver, hammer cold iron or mix incendiaries; a preacher, or an Occult working, blesses rounds.</w:t>
       </w:r>
     </w:p>
     <w:bookmarkEnd w:id="64"/>

</xml_diff>